<commit_message>
Update CA002 proposal document and script with official RTA B.E. 2562 evaluation criteria
</commit_message>
<xml_diff>
--- a/docs/CA002_project_proposal_timetable.docx
+++ b/docs/CA002_project_proposal_timetable.docx
@@ -203,7 +203,7 @@
           <w:color w:val="000000"/>
           <w:sz w:val="30"/>
         </w:rPr>
-        <w:t xml:space="preserve">   3.2 เป้าหมาย​เชิง​คุณภาพ: ความถูกต้อง​ของ​ข้อมูล​ชั่วโมง​เรียน​สะสม​และ​ระบบ​ตารางสอน​ปราศจาก​ข้อมูล​ชน​กัน​อยู่​ใน​ระดับ​ร้อยละ 100 และ​ความพึงพอใจ​ของ​กำลัง​พล​ผู้ใช้​ระบบ​เฉลี่ย​อยู่ในเกณฑ์​ดีมาก (มากกว่า​ร้อยละ 85)</w:t>
+        <w:t xml:space="preserve">   3.2 เป้าหมาย​เชิง​คุณภาพ: ความถูกต้อง​ของ​ข้อมูล​ชั่วโมง​เรียน​สะสม​และ​ระบบ​ตารางสอน​ปราศจาก​ข้อมูล​ชน​กัน​อยู่​ใน​ระดับ​ร้อยละ 100 และ​ความพึงพอใจ​ของ​กำลัง​พล​ผู้ใช้​ระบบ​เฉลี่ย​อยู่ในเกณฑ์​ดีมาก (ร้อยละ 80 - 89) ตาม​เกณฑ์​ประเมิน​กำลัง​พล​กองทัพบก พ.ศ. 2562</w:t>
       </w:r>
     </w:p>
     <w:p>
@@ -1498,7 +1498,7 @@
         </w:rPr>
         <w:t xml:space="preserve">   8.1 การ​วัดผล​เชิง​ระบบ: ทำการ​ทดสอบ​เจาะ​ระบบ​และ​ตรวจ​แฮ​ชร​หัส​ผ่าน​ผู้ดูแล​ระบบ 100​% พร้อม​ทดลอง​สลับ​ปิด​เน็ต​ตรวจ​ความคงทน​ของ​ระบบ​ออฟไลน์</w:t>
         <w:br/>
-        <w:t xml:space="preserve">   8.2 การ​วัด​ความพึงพอใจ: ทำการ​เก็บ​ผลสัมฤทธิ์​และ​แบบสอบถาม​ความพอใจ​จาก​แอดมิน​ครู​สอน จำนวน 50 นาย โดย​เกณฑ์​เฉลี่ย​ต้อง​อยู่​ใน​ระดับ​ดีมาก</w:t>
+        <w:t xml:space="preserve">   8.2 การ​วัด​ความพึงพอใจ: ทำ​การประเมิน​ความพึงพอใจ​การ​ใช้​ระบบ​ตารางสอน​ดิจิทัล​จาก​แอดมิน​และ​ครูผู้สอน​จำนวน 50 นาย โดย​ใช้​เครื่องมือ​แบบ​มาตราส่วน​ประมาณค่า 5 ระดับ (Likert Scale) แล้ว​คำนวณ​ผล​คะแนนเฉลี่ย​เป็น​ร้อยละ​เทียบ​กับ​เกณฑ์​มาตรฐาน​ตามระเบียบ​กองทัพบก ว่าด้วย​การ​ประเมินค่า​การ​ปฏิบัติงาน​กำลัง​พล​ของ​กองทัพบก พ.ศ. 2562 โดย​เกณฑ์​เฉลี่ย​ผล​ความพึงพอใจ​ต้อง​อยู่​ใน​ระดับ​ดีมาก (ร้อยละ 80 - 89)</w:t>
       </w:r>
     </w:p>
     <w:p>

</xml_diff>